<commit_message>
Claude assisted scripting and new backfill for both Linear and Freshdesk.
</commit_message>
<xml_diff>
--- a/KPI-lista - utkast.docx
+++ b/KPI-lista - utkast.docx
@@ -14,112 +14,226 @@
           <w:b/>
           <w:bCs/>
         </w:rPr>
-        <w:t xml:space="preserve">Sammanställning av </w:t>
-      </w:r>
-      <w:proofErr w:type="spellStart"/>
-      <w:r>
-        <w:rPr>
-          <w:b/>
-          <w:bCs/>
-        </w:rPr>
-        <w:t>KPI:er</w:t>
-      </w:r>
-      <w:proofErr w:type="spellEnd"/>
-      <w:r>
-        <w:rPr>
-          <w:b/>
-          <w:bCs/>
-        </w:rPr>
+        <w:t xml:space="preserve">Sammanställning av KPI:er </w:t>
+      </w:r>
+    </w:p>
+    <w:p/>
+    <w:p>
+      <w:r>
+        <w:t>Del 1: Ticket-flöde (Freshdesk)</w:t>
+      </w:r>
+    </w:p>
+    <w:p>
+      <w:r>
+        <w:t>1. Totalt antal skapade Tickets</w:t>
+      </w:r>
+    </w:p>
+    <w:p>
+      <w:r>
+        <w:t xml:space="preserve">2. </w:t>
+      </w:r>
+      <w:r>
+        <w:t xml:space="preserve">Procentandel </w:t>
+      </w:r>
+      <w:r>
+        <w:t xml:space="preserve">Tickets som aldrig lämnar Freshdesk </w:t>
+      </w:r>
+      <w:r>
+        <w:t xml:space="preserve">(= </w:t>
+      </w:r>
+      <w:r>
+        <w:t>Freshdesk t</w:t>
+      </w:r>
+      <w:r>
+        <w:t xml:space="preserve">otalt </w:t>
+      </w:r>
+      <w:r>
+        <w:t>minus ärenden som går vidare</w:t>
+      </w:r>
+      <w:r>
+        <w:t>)</w:t>
+      </w:r>
+    </w:p>
+    <w:p>
+      <w:r>
+        <w:t xml:space="preserve">3. Antal Tickets som </w:t>
+      </w:r>
+      <w:r>
+        <w:t>behöv</w:t>
+      </w:r>
+      <w:r>
+        <w:t>er</w:t>
+      </w:r>
+      <w:r>
+        <w:t xml:space="preserve"> gå vidare till Linear</w:t>
+      </w:r>
+      <w:r>
+        <w:t xml:space="preserve"> (väntar på triage</w:t>
+      </w:r>
+      <w:r>
+        <w:t>)</w:t>
+      </w:r>
+    </w:p>
+    <w:p>
+      <w:r>
+        <w:t>4</w:t>
+      </w:r>
+      <w:r>
+        <w:t>. Antal Tickets som nekas i triage – ska helst vara 0 (viktigt att se –</w:t>
+      </w:r>
+      <w:r>
         <w:t xml:space="preserve"> </w:t>
       </w:r>
+      <w:r>
+        <w:t>ett eget card med villkorsstyrd formatering så att det blir tydligt om denna siffra ökar)</w:t>
+      </w:r>
+    </w:p>
+    <w:p>
+      <w:r>
+        <w:t>5</w:t>
+      </w:r>
+      <w:r>
+        <w:t>. Antal Tickets som passerat triage men inte blivit Issues</w:t>
+      </w:r>
+      <w:r>
+        <w:br/>
+      </w:r>
+      <w:r>
+        <w:t xml:space="preserve">Ärenden i ”limbo”. Godkända för OpEx, men ännu inte ett utvecklingsärende (Issue) i Linear. </w:t>
+      </w:r>
     </w:p>
     <w:p/>
     <w:p>
       <w:r>
-        <w:t>Del 1: Ticket-flöde (</w:t>
-      </w:r>
-      <w:proofErr w:type="spellStart"/>
-      <w:r>
-        <w:t>Freshdesk</w:t>
-      </w:r>
-      <w:proofErr w:type="spellEnd"/>
+        <w:t>Del 2: Issue-produktion (Linear)</w:t>
+      </w:r>
+    </w:p>
+    <w:p>
+      <w:r>
+        <w:t>1. Antal skapade Issues</w:t>
+      </w:r>
+    </w:p>
+    <w:p>
+      <w:r>
+        <w:t xml:space="preserve">Ärenden som gått från ”limbo” till Linear och är ett faktiskt utvecklingsärende. </w:t>
+      </w:r>
+    </w:p>
+    <w:p>
+      <w:r>
+        <w:t xml:space="preserve">2. Antal </w:t>
+      </w:r>
+      <w:r>
+        <w:t>I</w:t>
+      </w:r>
+      <w:r>
+        <w:t xml:space="preserve">ssues </w:t>
+      </w:r>
+      <w:r>
+        <w:t xml:space="preserve">fördelat på </w:t>
+      </w:r>
+      <w:r>
+        <w:t xml:space="preserve">olika steg: 1. Unassigned, 2. Assigned, 3. Waiting for team (ev. separat diagram) och 4. </w:t>
+      </w:r>
+      <w:r>
+        <w:t>Done/Cancelled/Duplicate</w:t>
+      </w:r>
+    </w:p>
+    <w:p>
+      <w:r>
+        <w:t>3. Genomsnittlig tid för en Issue från limbo</w:t>
+      </w:r>
+      <w:r>
+        <w:t xml:space="preserve"> till </w:t>
+      </w:r>
+      <w:r>
+        <w:t xml:space="preserve">1. </w:t>
+      </w:r>
+      <w:r>
+        <w:t>skapad</w:t>
+      </w:r>
+      <w:r>
+        <w:t xml:space="preserve">/unassigned </w:t>
+      </w:r>
+      <w:r>
+        <w:t xml:space="preserve">till </w:t>
+      </w:r>
+      <w:r>
+        <w:t xml:space="preserve">2. </w:t>
+      </w:r>
+      <w:r>
+        <w:t xml:space="preserve">assigned och </w:t>
+      </w:r>
+      <w:r>
+        <w:t xml:space="preserve">3. </w:t>
+      </w:r>
+      <w:r>
+        <w:t>Waiting for team/</w:t>
+      </w:r>
+      <w:r>
+        <w:t xml:space="preserve">klarmarkerad. </w:t>
+      </w:r>
+    </w:p>
+    <w:p>
+      <w:r>
+        <w:t>4. Genomsnittlig tid i varje steg</w:t>
+      </w:r>
+    </w:p>
+    <w:p>
+      <w:r>
+        <w:t>5</w:t>
+      </w:r>
+      <w:r>
+        <w:t>. Antal Incidenter</w:t>
+      </w:r>
+    </w:p>
+    <w:p>
+      <w:r>
+        <w:t>6</w:t>
+      </w:r>
+      <w:r>
+        <w:t>. Fördelning av Issues per projekt (filtrer</w:t>
+      </w:r>
+      <w:r>
+        <w:t>ing</w:t>
+      </w:r>
+      <w:r>
+        <w:t xml:space="preserve"> på projekt: iChemistry, iPublisher, Chemsoft</w:t>
+      </w:r>
+      <w:r>
+        <w:t xml:space="preserve"> – möjlighet att välja ett eller flera</w:t>
+      </w:r>
       <w:r>
         <w:t>)</w:t>
       </w:r>
     </w:p>
-    <w:p>
-      <w:r>
-        <w:t xml:space="preserve">1. Totalt antal </w:t>
+    <w:p/>
+    <w:p>
+      <w:r>
+        <w:t>Del 3: Backlog-hälsa</w:t>
+      </w:r>
+    </w:p>
+    <w:p>
+      <w:r>
+        <w:t>1. Äldsta kvarvarande Issue i OpEx-kön</w:t>
+      </w:r>
+    </w:p>
+    <w:p>
+      <w:r>
+        <w:t xml:space="preserve">2. Moving average på </w:t>
       </w:r>
       <w:r>
         <w:t xml:space="preserve">skapade </w:t>
       </w:r>
       <w:r>
-        <w:t>Tickets</w:t>
-      </w:r>
-    </w:p>
-    <w:p>
-      <w:r>
-        <w:t xml:space="preserve">2. </w:t>
-      </w:r>
-      <w:r>
-        <w:t xml:space="preserve">Procentandel </w:t>
-      </w:r>
-      <w:r>
-        <w:t xml:space="preserve">Tickets som aldrig lämnar </w:t>
-      </w:r>
-      <w:proofErr w:type="spellStart"/>
-      <w:r>
-        <w:t>Freshdesk</w:t>
-      </w:r>
-      <w:proofErr w:type="spellEnd"/>
+        <w:t>Issues</w:t>
+      </w:r>
       <w:r>
         <w:t xml:space="preserve"> </w:t>
       </w:r>
-      <w:r>
-        <w:t xml:space="preserve">(= </w:t>
-      </w:r>
-      <w:proofErr w:type="spellStart"/>
-      <w:r>
-        <w:t>Freshdesk</w:t>
-      </w:r>
-      <w:proofErr w:type="spellEnd"/>
-      <w:r>
-        <w:t xml:space="preserve"> t</w:t>
-      </w:r>
-      <w:r>
-        <w:t xml:space="preserve">otalt </w:t>
-      </w:r>
-      <w:r>
-        <w:t>minus ärenden som går vidare</w:t>
-      </w:r>
-      <w:r>
-        <w:t>)</w:t>
-      </w:r>
-    </w:p>
-    <w:p>
-      <w:r>
-        <w:t xml:space="preserve">3. Antal Tickets som </w:t>
-      </w:r>
-      <w:r>
-        <w:t>behöv</w:t>
-      </w:r>
-      <w:r>
-        <w:t>er</w:t>
-      </w:r>
-      <w:r>
-        <w:t xml:space="preserve"> gå vidare till </w:t>
-      </w:r>
-      <w:proofErr w:type="spellStart"/>
-      <w:r>
-        <w:t>Linear</w:t>
-      </w:r>
-      <w:proofErr w:type="spellEnd"/>
-      <w:r>
-        <w:t xml:space="preserve"> (väntar på triage</w:t>
-      </w:r>
-      <w:r>
-        <w:t>)</w:t>
+    </w:p>
+    <w:p>
+      <w:r>
+        <w:t>3. Moving average på assigned issues</w:t>
       </w:r>
     </w:p>
     <w:p>
@@ -127,505 +241,29 @@
         <w:t>4</w:t>
       </w:r>
       <w:r>
-        <w:t>. Antal Tickets som nekas i triage – ska helst vara 0 (</w:t>
-      </w:r>
-      <w:r>
-        <w:t>viktigt att se –</w:t>
+        <w:t xml:space="preserve">. Moving average på </w:t>
+      </w:r>
+      <w:r>
+        <w:t>klarmarkerade Issues</w:t>
       </w:r>
       <w:r>
         <w:t xml:space="preserve"> </w:t>
       </w:r>
       <w:r>
-        <w:t xml:space="preserve">ett eget </w:t>
-      </w:r>
-      <w:proofErr w:type="spellStart"/>
-      <w:r>
-        <w:t>card</w:t>
-      </w:r>
-      <w:proofErr w:type="spellEnd"/>
-      <w:r>
-        <w:t xml:space="preserve"> med villkorsstyrd formatering så att det blir tydligt om denna siffra ökar)</w:t>
-      </w:r>
-    </w:p>
-    <w:p>
-      <w:r>
-        <w:t>5</w:t>
-      </w:r>
-      <w:r>
-        <w:t xml:space="preserve">. Antal Tickets som passerat triage men inte blivit </w:t>
-      </w:r>
-      <w:proofErr w:type="spellStart"/>
-      <w:r>
-        <w:t>Issues</w:t>
-      </w:r>
-      <w:proofErr w:type="spellEnd"/>
-      <w:r>
-        <w:br/>
-      </w:r>
-      <w:r>
-        <w:t>Ä</w:t>
-      </w:r>
-      <w:r>
-        <w:t>renden i ”limbo</w:t>
-      </w:r>
-      <w:r>
-        <w:t>”</w:t>
-      </w:r>
-      <w:r>
-        <w:t xml:space="preserve">. </w:t>
-      </w:r>
-      <w:r>
-        <w:t>G</w:t>
-      </w:r>
-      <w:r>
-        <w:t>odkända</w:t>
-      </w:r>
-      <w:r>
-        <w:t xml:space="preserve"> för </w:t>
-      </w:r>
-      <w:proofErr w:type="spellStart"/>
-      <w:r>
-        <w:t>OpEx</w:t>
-      </w:r>
-      <w:proofErr w:type="spellEnd"/>
-      <w:r>
-        <w:t xml:space="preserve">, men ännu inte </w:t>
-      </w:r>
-      <w:r>
-        <w:t xml:space="preserve">ett </w:t>
-      </w:r>
-      <w:r>
-        <w:t>utvecklingsärende (</w:t>
-      </w:r>
-      <w:proofErr w:type="spellStart"/>
-      <w:r>
-        <w:t>Issue</w:t>
-      </w:r>
-      <w:proofErr w:type="spellEnd"/>
-      <w:r>
-        <w:t xml:space="preserve">) i </w:t>
-      </w:r>
-      <w:proofErr w:type="spellStart"/>
-      <w:r>
-        <w:t>Linear</w:t>
-      </w:r>
-      <w:proofErr w:type="spellEnd"/>
-      <w:r>
-        <w:t xml:space="preserve">. </w:t>
+        <w:t>och Issues som är färdiga, men ”</w:t>
+      </w:r>
+      <w:r>
+        <w:t>waiting for team</w:t>
+      </w:r>
+      <w:r>
+        <w:t>”.</w:t>
       </w:r>
     </w:p>
     <w:p/>
     <w:p>
       <w:r>
-        <w:t xml:space="preserve">Del 2: </w:t>
-      </w:r>
-      <w:proofErr w:type="spellStart"/>
-      <w:r>
-        <w:t>Issue</w:t>
-      </w:r>
-      <w:proofErr w:type="spellEnd"/>
-      <w:r>
-        <w:t>-produktion (</w:t>
-      </w:r>
-      <w:proofErr w:type="spellStart"/>
-      <w:r>
-        <w:t>Linear</w:t>
-      </w:r>
-      <w:proofErr w:type="spellEnd"/>
-      <w:r>
-        <w:t>)</w:t>
-      </w:r>
-    </w:p>
-    <w:p>
-      <w:r>
-        <w:t xml:space="preserve">1. Antal skapade </w:t>
-      </w:r>
-      <w:proofErr w:type="spellStart"/>
-      <w:r>
-        <w:t>Issues</w:t>
-      </w:r>
-      <w:proofErr w:type="spellEnd"/>
-    </w:p>
-    <w:p>
-      <w:r>
-        <w:t xml:space="preserve">Ärenden som gått från ”limbo” till </w:t>
-      </w:r>
-      <w:proofErr w:type="spellStart"/>
-      <w:r>
-        <w:t>Linear</w:t>
-      </w:r>
-      <w:proofErr w:type="spellEnd"/>
-      <w:r>
-        <w:t xml:space="preserve"> och är ett faktiskt utvecklingsärende. </w:t>
-      </w:r>
-    </w:p>
-    <w:p>
-      <w:r>
-        <w:t xml:space="preserve">2. Antal </w:t>
-      </w:r>
-      <w:proofErr w:type="spellStart"/>
-      <w:r>
-        <w:t>I</w:t>
-      </w:r>
-      <w:r>
-        <w:t>ssues</w:t>
-      </w:r>
-      <w:proofErr w:type="spellEnd"/>
-      <w:r>
-        <w:t xml:space="preserve"> </w:t>
-      </w:r>
-      <w:r>
-        <w:t xml:space="preserve">fördelat på </w:t>
-      </w:r>
-      <w:r>
-        <w:t xml:space="preserve">olika steg: 1. </w:t>
-      </w:r>
-      <w:proofErr w:type="spellStart"/>
-      <w:r>
-        <w:t>Unassigned</w:t>
-      </w:r>
-      <w:proofErr w:type="spellEnd"/>
-      <w:r>
-        <w:t xml:space="preserve">, 2. </w:t>
-      </w:r>
-      <w:proofErr w:type="spellStart"/>
-      <w:r>
-        <w:t>Assigned</w:t>
-      </w:r>
-      <w:proofErr w:type="spellEnd"/>
-      <w:r>
-        <w:t xml:space="preserve">, 3. </w:t>
-      </w:r>
-      <w:proofErr w:type="spellStart"/>
-      <w:r>
-        <w:t>Waiting</w:t>
-      </w:r>
-      <w:proofErr w:type="spellEnd"/>
-      <w:r>
-        <w:t xml:space="preserve"> for team (ev. separat diagram) och 4. </w:t>
-      </w:r>
-      <w:proofErr w:type="spellStart"/>
-      <w:r>
-        <w:t>Done</w:t>
-      </w:r>
-      <w:proofErr w:type="spellEnd"/>
-      <w:r>
-        <w:t>/</w:t>
-      </w:r>
-      <w:proofErr w:type="spellStart"/>
-      <w:r>
-        <w:t>Cancelled</w:t>
-      </w:r>
-      <w:proofErr w:type="spellEnd"/>
-      <w:r>
-        <w:t>/</w:t>
-      </w:r>
-      <w:proofErr w:type="spellStart"/>
-      <w:r>
-        <w:t>Duplicate</w:t>
-      </w:r>
-      <w:proofErr w:type="spellEnd"/>
-    </w:p>
-    <w:p>
-      <w:r>
-        <w:t xml:space="preserve">3. Genomsnittlig tid för en </w:t>
-      </w:r>
-      <w:proofErr w:type="spellStart"/>
-      <w:r>
-        <w:t>Issue</w:t>
-      </w:r>
-      <w:proofErr w:type="spellEnd"/>
-      <w:r>
-        <w:t xml:space="preserve"> från limbo</w:t>
-      </w:r>
-      <w:r>
-        <w:t xml:space="preserve"> till </w:t>
-      </w:r>
-      <w:r>
-        <w:t xml:space="preserve">1. </w:t>
-      </w:r>
-      <w:r>
-        <w:t>skapad</w:t>
-      </w:r>
-      <w:r>
-        <w:t>/</w:t>
-      </w:r>
-      <w:proofErr w:type="spellStart"/>
-      <w:r>
-        <w:t>unassigned</w:t>
-      </w:r>
-      <w:proofErr w:type="spellEnd"/>
-      <w:r>
-        <w:t xml:space="preserve"> </w:t>
-      </w:r>
-      <w:r>
-        <w:t xml:space="preserve">till </w:t>
-      </w:r>
-      <w:r>
-        <w:t xml:space="preserve">2. </w:t>
-      </w:r>
-      <w:proofErr w:type="spellStart"/>
-      <w:r>
-        <w:t>assigned</w:t>
-      </w:r>
-      <w:proofErr w:type="spellEnd"/>
-      <w:r>
-        <w:t xml:space="preserve"> och </w:t>
-      </w:r>
-      <w:r>
-        <w:t xml:space="preserve">3. </w:t>
-      </w:r>
-      <w:proofErr w:type="spellStart"/>
-      <w:r>
-        <w:t>Waiting</w:t>
-      </w:r>
-      <w:proofErr w:type="spellEnd"/>
-      <w:r>
-        <w:t xml:space="preserve"> for team</w:t>
-      </w:r>
-      <w:r>
-        <w:t>/</w:t>
-      </w:r>
-      <w:r>
-        <w:t xml:space="preserve">klarmarkerad. </w:t>
-      </w:r>
-    </w:p>
-    <w:p>
-      <w:r>
-        <w:t xml:space="preserve">4. </w:t>
-      </w:r>
-      <w:r>
-        <w:t>Genomsnittlig tid i varje steg</w:t>
-      </w:r>
-    </w:p>
-    <w:p>
-      <w:r>
-        <w:t>5</w:t>
-      </w:r>
-      <w:r>
-        <w:t>. Antal Incidenter</w:t>
-      </w:r>
-    </w:p>
-    <w:p>
-      <w:r>
-        <w:t>6</w:t>
-      </w:r>
-      <w:r>
-        <w:t xml:space="preserve">. Fördelning av </w:t>
-      </w:r>
-      <w:proofErr w:type="spellStart"/>
-      <w:r>
-        <w:t>Issues</w:t>
-      </w:r>
-      <w:proofErr w:type="spellEnd"/>
-      <w:r>
-        <w:t xml:space="preserve"> per projekt</w:t>
-      </w:r>
-      <w:r>
-        <w:t xml:space="preserve"> (filtrer</w:t>
-      </w:r>
-      <w:r>
-        <w:t>ing</w:t>
-      </w:r>
-      <w:r>
-        <w:t xml:space="preserve"> på projekt: </w:t>
-      </w:r>
-      <w:proofErr w:type="spellStart"/>
-      <w:r>
-        <w:t>iChemistry</w:t>
-      </w:r>
-      <w:proofErr w:type="spellEnd"/>
-      <w:r>
-        <w:t xml:space="preserve">, </w:t>
-      </w:r>
-      <w:proofErr w:type="spellStart"/>
-      <w:r>
-        <w:t>iPublisher</w:t>
-      </w:r>
-      <w:proofErr w:type="spellEnd"/>
-      <w:r>
-        <w:t xml:space="preserve">, </w:t>
-      </w:r>
-      <w:proofErr w:type="spellStart"/>
-      <w:r>
-        <w:t>Chemsoft</w:t>
-      </w:r>
-      <w:proofErr w:type="spellEnd"/>
-      <w:r>
-        <w:t xml:space="preserve"> – möjlighet att välja ett eller flera</w:t>
-      </w:r>
-      <w:r>
-        <w:t>)</w:t>
-      </w:r>
-    </w:p>
-    <w:p/>
-    <w:p>
-      <w:r>
-        <w:t xml:space="preserve">Del 3: </w:t>
-      </w:r>
-      <w:proofErr w:type="spellStart"/>
-      <w:r>
-        <w:t>Backlog</w:t>
-      </w:r>
-      <w:proofErr w:type="spellEnd"/>
-      <w:r>
-        <w:t>-hälsa</w:t>
-      </w:r>
-    </w:p>
-    <w:p>
-      <w:r>
-        <w:t xml:space="preserve">1. Äldsta kvarvarande </w:t>
-      </w:r>
-      <w:proofErr w:type="spellStart"/>
-      <w:r>
-        <w:t>Issue</w:t>
-      </w:r>
-      <w:proofErr w:type="spellEnd"/>
-      <w:r>
-        <w:t xml:space="preserve"> i </w:t>
-      </w:r>
-      <w:proofErr w:type="spellStart"/>
-      <w:r>
-        <w:t>OpEx</w:t>
-      </w:r>
-      <w:proofErr w:type="spellEnd"/>
-      <w:r>
-        <w:t>-kön</w:t>
-      </w:r>
-    </w:p>
-    <w:p>
-      <w:r>
-        <w:t xml:space="preserve">2. </w:t>
-      </w:r>
-      <w:proofErr w:type="spellStart"/>
-      <w:r>
-        <w:t>Moving</w:t>
-      </w:r>
-      <w:proofErr w:type="spellEnd"/>
-      <w:r>
-        <w:t xml:space="preserve"> </w:t>
-      </w:r>
-      <w:proofErr w:type="spellStart"/>
-      <w:r>
-        <w:t>average</w:t>
-      </w:r>
-      <w:proofErr w:type="spellEnd"/>
-      <w:r>
-        <w:t xml:space="preserve"> på </w:t>
-      </w:r>
-      <w:r>
-        <w:t xml:space="preserve">skapade </w:t>
-      </w:r>
-      <w:proofErr w:type="spellStart"/>
-      <w:r>
-        <w:t>Issues</w:t>
-      </w:r>
-      <w:proofErr w:type="spellEnd"/>
-      <w:r>
-        <w:t xml:space="preserve"> </w:t>
-      </w:r>
-    </w:p>
-    <w:p>
-      <w:r>
-        <w:t xml:space="preserve">3. </w:t>
-      </w:r>
-      <w:proofErr w:type="spellStart"/>
-      <w:r>
-        <w:t>Moving</w:t>
-      </w:r>
-      <w:proofErr w:type="spellEnd"/>
-      <w:r>
-        <w:t xml:space="preserve"> </w:t>
-      </w:r>
-      <w:proofErr w:type="spellStart"/>
-      <w:r>
-        <w:t>average</w:t>
-      </w:r>
-      <w:proofErr w:type="spellEnd"/>
-      <w:r>
-        <w:t xml:space="preserve"> på </w:t>
-      </w:r>
-      <w:proofErr w:type="spellStart"/>
-      <w:r>
-        <w:t>assigned</w:t>
-      </w:r>
-      <w:proofErr w:type="spellEnd"/>
-      <w:r>
-        <w:t xml:space="preserve"> </w:t>
-      </w:r>
-      <w:proofErr w:type="spellStart"/>
-      <w:r>
-        <w:t>issues</w:t>
-      </w:r>
-      <w:proofErr w:type="spellEnd"/>
-    </w:p>
-    <w:p>
-      <w:r>
-        <w:t>4</w:t>
-      </w:r>
-      <w:r>
-        <w:t xml:space="preserve">. </w:t>
-      </w:r>
-      <w:proofErr w:type="spellStart"/>
-      <w:r>
-        <w:t>Moving</w:t>
-      </w:r>
-      <w:proofErr w:type="spellEnd"/>
-      <w:r>
-        <w:t xml:space="preserve"> </w:t>
-      </w:r>
-      <w:proofErr w:type="spellStart"/>
-      <w:r>
-        <w:t>average</w:t>
-      </w:r>
-      <w:proofErr w:type="spellEnd"/>
-      <w:r>
-        <w:t xml:space="preserve"> på </w:t>
-      </w:r>
-      <w:r>
-        <w:t xml:space="preserve">klarmarkerade </w:t>
-      </w:r>
-      <w:proofErr w:type="spellStart"/>
-      <w:r>
-        <w:t>Issues</w:t>
-      </w:r>
-      <w:proofErr w:type="spellEnd"/>
-      <w:r>
-        <w:t xml:space="preserve"> </w:t>
-      </w:r>
-      <w:r>
-        <w:t xml:space="preserve">och </w:t>
-      </w:r>
-      <w:proofErr w:type="spellStart"/>
-      <w:r>
-        <w:t>Issues</w:t>
-      </w:r>
-      <w:proofErr w:type="spellEnd"/>
-      <w:r>
-        <w:t xml:space="preserve"> som är färdiga, men ”</w:t>
-      </w:r>
-      <w:proofErr w:type="spellStart"/>
-      <w:r>
-        <w:t>waiting</w:t>
-      </w:r>
-      <w:proofErr w:type="spellEnd"/>
-      <w:r>
-        <w:t xml:space="preserve"> for team</w:t>
-      </w:r>
-      <w:r>
-        <w:t>”.</w:t>
-      </w:r>
-    </w:p>
-    <w:p/>
-    <w:p>
-      <w:r>
-        <w:t xml:space="preserve">Del 4: Personbaserade </w:t>
-      </w:r>
-      <w:proofErr w:type="spellStart"/>
-      <w:r>
-        <w:t>KPI:er</w:t>
-      </w:r>
-      <w:proofErr w:type="spellEnd"/>
+        <w:t>Del 4: Personbaserade KPI:er</w:t>
+      </w:r>
     </w:p>
     <w:p>
       <w:r>
@@ -638,26 +276,10 @@
         <w:t>1</w:t>
       </w:r>
       <w:r>
-        <w:t xml:space="preserve">. Antal </w:t>
-      </w:r>
-      <w:proofErr w:type="spellStart"/>
-      <w:r>
-        <w:t>Issues</w:t>
-      </w:r>
-      <w:proofErr w:type="spellEnd"/>
-      <w:r>
-        <w:t xml:space="preserve"> hanterade per person (</w:t>
-      </w:r>
-      <w:r>
-        <w:t xml:space="preserve">från </w:t>
-      </w:r>
-      <w:proofErr w:type="spellStart"/>
-      <w:r>
-        <w:t>assigned</w:t>
-      </w:r>
-      <w:proofErr w:type="spellEnd"/>
-      <w:r>
-        <w:t xml:space="preserve"> till klarmarkerad</w:t>
+        <w:t>. Antal Issues hanterade per person (</w:t>
+      </w:r>
+      <w:r>
+        <w:t>från assigned till klarmarkerad</w:t>
       </w:r>
       <w:r>
         <w:t>/WFT</w:t>
@@ -677,24 +299,13 @@
         <w:t>. Genomsnittlig ledtid per person (</w:t>
       </w:r>
       <w:r>
-        <w:t xml:space="preserve">från </w:t>
-      </w:r>
-      <w:proofErr w:type="spellStart"/>
-      <w:r>
-        <w:t>assigned</w:t>
-      </w:r>
-      <w:proofErr w:type="spellEnd"/>
-      <w:r>
-        <w:t xml:space="preserve"> till klarmarkerad</w:t>
+        <w:t>från assigned till klarmarkerad</w:t>
       </w:r>
       <w:r>
         <w:t>/WFT</w:t>
       </w:r>
       <w:r>
-        <w:t xml:space="preserve"> - </w:t>
-      </w:r>
-      <w:r>
-        <w:t>som ovan, men filtrerat per person</w:t>
+        <w:t xml:space="preserve"> - som ovan, men filtrerat per person</w:t>
       </w:r>
       <w:r>
         <w:t>)</w:t>
@@ -767,97 +378,43 @@
           <w:iCs/>
           <w:highlight w:val="yellow"/>
         </w:rPr>
-        <w:t xml:space="preserve">(via koppling till </w:t>
-      </w:r>
-      <w:proofErr w:type="spellStart"/>
+        <w:t>(via koppling till iChemistry/iPublisher och Chemsoft för att se aktiviteten)</w:t>
+      </w:r>
       <w:r>
         <w:rPr>
           <w:i/>
           <w:iCs/>
           <w:highlight w:val="yellow"/>
         </w:rPr>
-        <w:t>iChemistry</w:t>
-      </w:r>
-      <w:proofErr w:type="spellEnd"/>
+        <w:t>.</w:t>
+      </w:r>
       <w:r>
         <w:rPr>
           <w:i/>
           <w:iCs/>
-          <w:highlight w:val="yellow"/>
-        </w:rPr>
-        <w:t>/</w:t>
-      </w:r>
-      <w:proofErr w:type="spellStart"/>
-      <w:r>
+        </w:rPr>
+        <w:t xml:space="preserve"> </w:t>
+      </w:r>
+    </w:p>
+    <w:p>
+      <w:pPr>
         <w:rPr>
           <w:i/>
           <w:iCs/>
-          <w:highlight w:val="yellow"/>
-        </w:rPr>
-        <w:t>iPublisher</w:t>
-      </w:r>
-      <w:proofErr w:type="spellEnd"/>
-      <w:r>
+        </w:rPr>
+      </w:pPr>
+    </w:p>
+    <w:p>
+      <w:pPr>
         <w:rPr>
           <w:i/>
           <w:iCs/>
-          <w:highlight w:val="yellow"/>
-        </w:rPr>
-        <w:t xml:space="preserve"> och </w:t>
-      </w:r>
-      <w:proofErr w:type="spellStart"/>
+        </w:rPr>
+      </w:pPr>
       <w:r>
         <w:rPr>
           <w:i/>
           <w:iCs/>
-          <w:highlight w:val="yellow"/>
-        </w:rPr>
-        <w:t>Chemsoft</w:t>
-      </w:r>
-      <w:proofErr w:type="spellEnd"/>
-      <w:r>
-        <w:rPr>
-          <w:i/>
-          <w:iCs/>
-          <w:highlight w:val="yellow"/>
-        </w:rPr>
-        <w:t xml:space="preserve"> för att se aktiviteten)</w:t>
-      </w:r>
-      <w:r>
-        <w:rPr>
-          <w:i/>
-          <w:iCs/>
-          <w:highlight w:val="yellow"/>
-        </w:rPr>
-        <w:t>.</w:t>
-      </w:r>
-      <w:r>
-        <w:rPr>
-          <w:i/>
-          <w:iCs/>
-        </w:rPr>
-        <w:t xml:space="preserve"> </w:t>
-      </w:r>
-    </w:p>
-    <w:p>
-      <w:pPr>
-        <w:rPr>
-          <w:i/>
-          <w:iCs/>
-        </w:rPr>
-      </w:pPr>
-    </w:p>
-    <w:p>
-      <w:pPr>
-        <w:rPr>
-          <w:i/>
-          <w:iCs/>
-        </w:rPr>
-      </w:pPr>
-      <w:r>
-        <w:rPr>
-          <w:i/>
-          <w:iCs/>
         </w:rPr>
         <w:br w:type="page"/>
       </w:r>
@@ -883,15 +440,7 @@
           <w:b/>
           <w:bCs/>
         </w:rPr>
-        <w:t xml:space="preserve"> </w:t>
-      </w:r>
-      <w:proofErr w:type="spellStart"/>
-      <w:r>
-        <w:rPr>
-          <w:b/>
-          <w:bCs/>
-        </w:rPr>
-        <w:t>Freshdesk</w:t>
+        <w:t xml:space="preserve"> Freshdesk</w:t>
       </w:r>
       <w:r>
         <w:rPr>
@@ -901,7 +450,6 @@
         <w:noBreakHyphen/>
         <w:t>KPI:er</w:t>
       </w:r>
-      <w:proofErr w:type="spellEnd"/>
     </w:p>
     <w:p>
       <w:pPr>
@@ -928,21 +476,8 @@
     </w:p>
     <w:p>
       <w:r>
-        <w:t xml:space="preserve">→ </w:t>
-      </w:r>
-      <w:proofErr w:type="spellStart"/>
-      <w:r>
-        <w:t>FactFreshdeskTickets</w:t>
-      </w:r>
-      <w:proofErr w:type="spellEnd"/>
-      <w:r>
-        <w:t xml:space="preserve"> + </w:t>
-      </w:r>
-      <w:proofErr w:type="spellStart"/>
-      <w:r>
-        <w:t>DateKeyCreated</w:t>
-      </w:r>
-      <w:proofErr w:type="spellEnd"/>
+        <w:t>→ FactFreshdeskTickets + DateKeyCreated</w:t>
+      </w:r>
     </w:p>
     <w:p>
       <w:pPr>
@@ -969,21 +504,8 @@
     </w:p>
     <w:p>
       <w:r>
-        <w:t xml:space="preserve">→ </w:t>
-      </w:r>
-      <w:proofErr w:type="spellStart"/>
-      <w:r>
-        <w:t>FactFreshdeskTickets</w:t>
-      </w:r>
-      <w:proofErr w:type="spellEnd"/>
-      <w:r>
-        <w:t xml:space="preserve"> + </w:t>
-      </w:r>
-      <w:proofErr w:type="spellStart"/>
-      <w:r>
-        <w:t>DimFreshdeskStatus.KPIStatusGroup</w:t>
-      </w:r>
-      <w:proofErr w:type="spellEnd"/>
+        <w:t>→ FactFreshdeskTickets + DimFreshdeskStatus.KPIStatusGroup</w:t>
+      </w:r>
     </w:p>
     <w:p>
       <w:pPr>
@@ -1010,39 +532,7 @@
     </w:p>
     <w:p>
       <w:r>
-        <w:t xml:space="preserve">→ </w:t>
-      </w:r>
-      <w:proofErr w:type="spellStart"/>
-      <w:r>
-        <w:t>DimFreshdeskStatus</w:t>
-      </w:r>
-      <w:proofErr w:type="spellEnd"/>
-      <w:r>
-        <w:t xml:space="preserve"> (</w:t>
-      </w:r>
-      <w:proofErr w:type="gramStart"/>
-      <w:r>
-        <w:t>t.ex.</w:t>
-      </w:r>
-      <w:proofErr w:type="gramEnd"/>
-      <w:r>
-        <w:t xml:space="preserve"> </w:t>
-      </w:r>
-      <w:proofErr w:type="spellStart"/>
-      <w:r>
-        <w:t>Pending</w:t>
-      </w:r>
-      <w:proofErr w:type="spellEnd"/>
-      <w:r>
-        <w:t xml:space="preserve">, Info </w:t>
-      </w:r>
-      <w:proofErr w:type="spellStart"/>
-      <w:r>
-        <w:t>needed</w:t>
-      </w:r>
-      <w:proofErr w:type="spellEnd"/>
-      <w:r>
-        <w:t>)</w:t>
+        <w:t>→ DimFreshdeskStatus (t.ex. Pending, Info needed)</w:t>
       </w:r>
     </w:p>
     <w:p>
@@ -1070,23 +560,7 @@
     </w:p>
     <w:p>
       <w:r>
-        <w:t xml:space="preserve">→ </w:t>
-      </w:r>
-      <w:proofErr w:type="spellStart"/>
-      <w:r>
-        <w:t>DimFreshdeskStatus</w:t>
-      </w:r>
-      <w:proofErr w:type="spellEnd"/>
-      <w:r>
-        <w:t xml:space="preserve"> (om du definierar en grupp “</w:t>
-      </w:r>
-      <w:proofErr w:type="spellStart"/>
-      <w:r>
-        <w:t>Rejected</w:t>
-      </w:r>
-      <w:proofErr w:type="spellEnd"/>
-      <w:r>
-        <w:t>”)</w:t>
+        <w:t>→ DimFreshdeskStatus (om du definierar en grupp “Rejected”)</w:t>
       </w:r>
     </w:p>
     <w:p>
@@ -1114,15 +588,7 @@
     </w:p>
     <w:p>
       <w:r>
-        <w:t xml:space="preserve">→ </w:t>
-      </w:r>
-      <w:proofErr w:type="spellStart"/>
-      <w:r>
-        <w:t>StatusID</w:t>
-      </w:r>
-      <w:proofErr w:type="spellEnd"/>
-      <w:r>
-        <w:t xml:space="preserve"> IN (4,5)</w:t>
+        <w:t>→ StatusID IN (4,5)</w:t>
       </w:r>
     </w:p>
     <w:p>
@@ -1150,15 +616,7 @@
     </w:p>
     <w:p>
       <w:r>
-        <w:t xml:space="preserve">→ </w:t>
-      </w:r>
-      <w:proofErr w:type="spellStart"/>
-      <w:r>
-        <w:t>IsEscalated</w:t>
-      </w:r>
-      <w:proofErr w:type="spellEnd"/>
-      <w:r>
-        <w:t xml:space="preserve"> = 1</w:t>
+        <w:t>→ IsEscalated = 1</w:t>
       </w:r>
     </w:p>
     <w:p>
@@ -1181,17 +639,8 @@
           <w:b/>
           <w:bCs/>
         </w:rPr>
-        <w:t xml:space="preserve"> </w:t>
-      </w:r>
-      <w:proofErr w:type="spellStart"/>
-      <w:r>
-        <w:rPr>
-          <w:b/>
-          <w:bCs/>
-        </w:rPr>
-        <w:t>Backlog</w:t>
-      </w:r>
-      <w:proofErr w:type="spellEnd"/>
+        <w:t xml:space="preserve"> Backlog</w:t>
+      </w:r>
       <w:r>
         <w:rPr>
           <w:b/>
@@ -1203,21 +652,8 @@
     </w:p>
     <w:p>
       <w:r>
-        <w:t xml:space="preserve">→ </w:t>
-      </w:r>
-      <w:proofErr w:type="spellStart"/>
-      <w:r>
-        <w:t>StatusID</w:t>
-      </w:r>
-      <w:proofErr w:type="spellEnd"/>
-      <w:r>
-        <w:t xml:space="preserve"> + </w:t>
-      </w:r>
-      <w:proofErr w:type="spellStart"/>
-      <w:r>
-        <w:t>SnapshotTS</w:t>
-      </w:r>
-      <w:proofErr w:type="spellEnd"/>
+        <w:t>→ StatusID + SnapshotTS</w:t>
+      </w:r>
     </w:p>
     <w:p>
       <w:pPr>
@@ -1239,51 +675,13 @@
           <w:b/>
           <w:bCs/>
         </w:rPr>
-        <w:t xml:space="preserve"> </w:t>
-      </w:r>
-      <w:proofErr w:type="spellStart"/>
-      <w:r>
-        <w:rPr>
-          <w:b/>
-          <w:bCs/>
-        </w:rPr>
-        <w:t>Moving</w:t>
-      </w:r>
-      <w:proofErr w:type="spellEnd"/>
-      <w:r>
-        <w:rPr>
-          <w:b/>
-          <w:bCs/>
-        </w:rPr>
-        <w:t xml:space="preserve"> </w:t>
-      </w:r>
-      <w:proofErr w:type="spellStart"/>
-      <w:r>
-        <w:rPr>
-          <w:b/>
-          <w:bCs/>
-        </w:rPr>
-        <w:t>averages</w:t>
-      </w:r>
-      <w:proofErr w:type="spellEnd"/>
-    </w:p>
-    <w:p>
-      <w:r>
-        <w:t xml:space="preserve">→ </w:t>
-      </w:r>
-      <w:proofErr w:type="spellStart"/>
-      <w:r>
-        <w:t>DateKeyCreated</w:t>
-      </w:r>
-      <w:proofErr w:type="spellEnd"/>
-      <w:r>
-        <w:t xml:space="preserve"> / </w:t>
-      </w:r>
-      <w:proofErr w:type="spellStart"/>
-      <w:r>
-        <w:t>DateKeyUpdated</w:t>
-      </w:r>
-      <w:proofErr w:type="spellEnd"/>
+        <w:t xml:space="preserve"> Moving averages</w:t>
+      </w:r>
+    </w:p>
+    <w:p>
+      <w:r>
+        <w:t>→ DateKeyCreated / DateKeyUpdated</w:t>
+      </w:r>
     </w:p>
     <w:p>
       <w:pPr>
@@ -1310,21 +708,8 @@
     </w:p>
     <w:p>
       <w:r>
-        <w:t xml:space="preserve">→ </w:t>
-      </w:r>
-      <w:proofErr w:type="spellStart"/>
-      <w:r>
-        <w:t>SnapshotTS</w:t>
-      </w:r>
-      <w:proofErr w:type="spellEnd"/>
-      <w:r>
-        <w:t xml:space="preserve"> + </w:t>
-      </w:r>
-      <w:proofErr w:type="spellStart"/>
-      <w:r>
-        <w:t>DimDate</w:t>
-      </w:r>
-      <w:proofErr w:type="spellEnd"/>
+        <w:t>→ SnapshotTS + DimDate</w:t>
+      </w:r>
     </w:p>
     <w:p>
       <w:r>
@@ -1340,17 +725,8 @@
           <w:b/>
           <w:bCs/>
         </w:rPr>
-        <w:t xml:space="preserve"> </w:t>
-      </w:r>
-      <w:proofErr w:type="spellStart"/>
-      <w:r>
-        <w:rPr>
-          <w:b/>
-          <w:bCs/>
-        </w:rPr>
-        <w:t>Freshdesk</w:t>
-      </w:r>
-      <w:proofErr w:type="spellEnd"/>
+        <w:t xml:space="preserve"> Freshdesk</w:t>
+      </w:r>
       <w:r>
         <w:rPr>
           <w:b/>
@@ -1380,15 +756,7 @@
           <w:b/>
           <w:bCs/>
         </w:rPr>
-        <w:t xml:space="preserve"> </w:t>
-      </w:r>
-      <w:proofErr w:type="spellStart"/>
-      <w:r>
-        <w:rPr>
-          <w:b/>
-          <w:bCs/>
-        </w:rPr>
-        <w:t>Linear</w:t>
+        <w:t xml:space="preserve"> Linear</w:t>
       </w:r>
       <w:r>
         <w:rPr>
@@ -1398,7 +766,6 @@
         <w:noBreakHyphen/>
         <w:t>KPI:er</w:t>
       </w:r>
-      <w:proofErr w:type="spellEnd"/>
     </w:p>
     <w:p>
       <w:pPr>
@@ -1420,27 +787,13 @@
           <w:b/>
           <w:bCs/>
         </w:rPr>
-        <w:t xml:space="preserve"> Antal skapade </w:t>
-      </w:r>
-      <w:proofErr w:type="spellStart"/>
-      <w:r>
-        <w:rPr>
-          <w:b/>
-          <w:bCs/>
-        </w:rPr>
-        <w:t>issues</w:t>
-      </w:r>
-      <w:proofErr w:type="spellEnd"/>
-    </w:p>
-    <w:p>
-      <w:r>
-        <w:t xml:space="preserve">→ </w:t>
-      </w:r>
-      <w:proofErr w:type="spellStart"/>
-      <w:r>
-        <w:t>DateKeyCreated</w:t>
-      </w:r>
-      <w:proofErr w:type="spellEnd"/>
+        <w:t xml:space="preserve"> Antal skapade issues</w:t>
+      </w:r>
+    </w:p>
+    <w:p>
+      <w:r>
+        <w:t>→ DateKeyCreated</w:t>
+      </w:r>
     </w:p>
     <w:p>
       <w:pPr>
@@ -1462,51 +815,13 @@
           <w:b/>
           <w:bCs/>
         </w:rPr>
-        <w:t xml:space="preserve"> Antal </w:t>
-      </w:r>
-      <w:proofErr w:type="spellStart"/>
-      <w:r>
-        <w:rPr>
-          <w:b/>
-          <w:bCs/>
-        </w:rPr>
-        <w:t>issues</w:t>
-      </w:r>
-      <w:proofErr w:type="spellEnd"/>
-      <w:r>
-        <w:rPr>
-          <w:b/>
-          <w:bCs/>
-        </w:rPr>
-        <w:t xml:space="preserve"> per </w:t>
-      </w:r>
-      <w:proofErr w:type="spellStart"/>
-      <w:r>
-        <w:rPr>
-          <w:b/>
-          <w:bCs/>
-        </w:rPr>
-        <w:t>state</w:t>
-      </w:r>
-      <w:proofErr w:type="spellEnd"/>
-    </w:p>
-    <w:p>
-      <w:r>
-        <w:t xml:space="preserve">→ </w:t>
-      </w:r>
-      <w:proofErr w:type="spellStart"/>
-      <w:r>
-        <w:t>StateType</w:t>
-      </w:r>
-      <w:proofErr w:type="spellEnd"/>
-      <w:r>
-        <w:t xml:space="preserve"> / </w:t>
-      </w:r>
-      <w:proofErr w:type="spellStart"/>
-      <w:r>
-        <w:t>StateName</w:t>
-      </w:r>
-      <w:proofErr w:type="spellEnd"/>
+        <w:t xml:space="preserve"> Antal issues per state</w:t>
+      </w:r>
+    </w:p>
+    <w:p>
+      <w:r>
+        <w:t>→ StateType / StateName</w:t>
+      </w:r>
     </w:p>
     <w:p>
       <w:pPr>
@@ -1528,76 +843,12 @@
           <w:b/>
           <w:bCs/>
         </w:rPr>
-        <w:t xml:space="preserve"> Ledtid (</w:t>
-      </w:r>
-      <w:proofErr w:type="spellStart"/>
-      <w:r>
-        <w:rPr>
-          <w:b/>
-          <w:bCs/>
-        </w:rPr>
-        <w:t>Created</w:t>
-      </w:r>
-      <w:proofErr w:type="spellEnd"/>
-      <w:r>
-        <w:rPr>
-          <w:b/>
-          <w:bCs/>
-        </w:rPr>
-        <w:t xml:space="preserve"> → </w:t>
-      </w:r>
-      <w:proofErr w:type="spellStart"/>
-      <w:r>
-        <w:rPr>
-          <w:b/>
-          <w:bCs/>
-        </w:rPr>
-        <w:t>Done</w:t>
-      </w:r>
-      <w:proofErr w:type="spellEnd"/>
-      <w:r>
-        <w:rPr>
-          <w:b/>
-          <w:bCs/>
-        </w:rPr>
-        <w:t>)</w:t>
-      </w:r>
-    </w:p>
-    <w:p>
-      <w:r>
-        <w:t xml:space="preserve">→ </w:t>
-      </w:r>
-      <w:proofErr w:type="spellStart"/>
-      <w:r>
-        <w:t>DateKeyCreated</w:t>
-      </w:r>
-      <w:proofErr w:type="spellEnd"/>
-      <w:r>
-        <w:t xml:space="preserve"> → </w:t>
-      </w:r>
-      <w:proofErr w:type="spellStart"/>
-      <w:r>
-        <w:t>DateKeyUpdated</w:t>
-      </w:r>
-      <w:proofErr w:type="spellEnd"/>
-      <w:r>
-        <w:t xml:space="preserve"> → </w:t>
-      </w:r>
-      <w:proofErr w:type="spellStart"/>
-      <w:r>
-        <w:t>StateName</w:t>
-      </w:r>
-      <w:proofErr w:type="spellEnd"/>
-      <w:r>
-        <w:t xml:space="preserve"> = '</w:t>
-      </w:r>
-      <w:proofErr w:type="spellStart"/>
-      <w:r>
-        <w:t>Done</w:t>
-      </w:r>
-      <w:proofErr w:type="spellEnd"/>
-      <w:r>
-        <w:t>' eller motsvarande</w:t>
+        <w:t xml:space="preserve"> Ledtid (Created → Done)</w:t>
+      </w:r>
+    </w:p>
+    <w:p>
+      <w:r>
+        <w:t>→ DateKeyCreated → DateKeyUpdated → StateName = 'Done' eller motsvarande</w:t>
       </w:r>
     </w:p>
     <w:p>
@@ -1625,21 +876,8 @@
     </w:p>
     <w:p>
       <w:r>
-        <w:t xml:space="preserve">→ </w:t>
-      </w:r>
-      <w:proofErr w:type="spellStart"/>
-      <w:r>
-        <w:t>SnapshotTS</w:t>
-      </w:r>
-      <w:proofErr w:type="spellEnd"/>
-      <w:r>
-        <w:t xml:space="preserve"> + </w:t>
-      </w:r>
-      <w:proofErr w:type="spellStart"/>
-      <w:r>
-        <w:t>StateType</w:t>
-      </w:r>
-      <w:proofErr w:type="spellEnd"/>
+        <w:t>→ SnapshotTS + StateType</w:t>
+      </w:r>
     </w:p>
     <w:p>
       <w:pPr>
@@ -1661,36 +899,14 @@
           <w:b/>
           <w:bCs/>
         </w:rPr>
-        <w:t xml:space="preserve"> Personbaserade </w:t>
-      </w:r>
-      <w:proofErr w:type="spellStart"/>
-      <w:r>
-        <w:rPr>
-          <w:b/>
-          <w:bCs/>
-        </w:rPr>
-        <w:t>KPI:er</w:t>
-      </w:r>
-      <w:proofErr w:type="spellEnd"/>
+        <w:t xml:space="preserve"> Personbaserade KPI:er</w:t>
+      </w:r>
     </w:p>
     <w:p>
       <w:r>
         <w:lastRenderedPageBreak/>
-        <w:t xml:space="preserve">→ </w:t>
-      </w:r>
-      <w:proofErr w:type="spellStart"/>
-      <w:r>
-        <w:t>AssigneeID</w:t>
-      </w:r>
-      <w:proofErr w:type="spellEnd"/>
-      <w:r>
-        <w:t xml:space="preserve"> → </w:t>
-      </w:r>
-      <w:proofErr w:type="spellStart"/>
-      <w:r>
-        <w:t>DimPerson</w:t>
-      </w:r>
-      <w:proofErr w:type="spellEnd"/>
+        <w:t>→ AssigneeID → DimPerson</w:t>
+      </w:r>
     </w:p>
     <w:p>
       <w:pPr>
@@ -1712,34 +928,12 @@
           <w:b/>
           <w:bCs/>
         </w:rPr>
-        <w:t xml:space="preserve"> </w:t>
-      </w:r>
-      <w:proofErr w:type="spellStart"/>
-      <w:r>
-        <w:rPr>
-          <w:b/>
-          <w:bCs/>
-        </w:rPr>
-        <w:t>Throughput</w:t>
-      </w:r>
-      <w:proofErr w:type="spellEnd"/>
-    </w:p>
-    <w:p>
-      <w:r>
-        <w:t xml:space="preserve">→ </w:t>
-      </w:r>
-      <w:proofErr w:type="gramStart"/>
-      <w:r>
-        <w:t>Count(</w:t>
-      </w:r>
-      <w:proofErr w:type="spellStart"/>
-      <w:proofErr w:type="gramEnd"/>
-      <w:r>
-        <w:t>Done</w:t>
-      </w:r>
-      <w:proofErr w:type="spellEnd"/>
-      <w:r>
-        <w:t>) per vecka/månad</w:t>
+        <w:t xml:space="preserve"> Throughput</w:t>
+      </w:r>
+    </w:p>
+    <w:p>
+      <w:r>
+        <w:t>→ Count(Done) per vecka/månad</w:t>
       </w:r>
     </w:p>
     <w:p>
@@ -1762,35 +956,13 @@
           <w:b/>
           <w:bCs/>
         </w:rPr>
-        <w:t xml:space="preserve"> Cycle </w:t>
-      </w:r>
-      <w:proofErr w:type="spellStart"/>
-      <w:r>
-        <w:rPr>
-          <w:b/>
-          <w:bCs/>
-        </w:rPr>
-        <w:t>time</w:t>
-      </w:r>
-      <w:proofErr w:type="spellEnd"/>
-    </w:p>
-    <w:p>
-      <w:r>
-        <w:t xml:space="preserve">→ </w:t>
-      </w:r>
-      <w:proofErr w:type="spellStart"/>
-      <w:r>
-        <w:t>Created</w:t>
-      </w:r>
-      <w:proofErr w:type="spellEnd"/>
-      <w:r>
-        <w:t xml:space="preserve"> → </w:t>
-      </w:r>
-      <w:proofErr w:type="spellStart"/>
-      <w:r>
-        <w:t>Done</w:t>
-      </w:r>
-      <w:proofErr w:type="spellEnd"/>
+        <w:t xml:space="preserve"> Cycle time</w:t>
+      </w:r>
+    </w:p>
+    <w:p>
+      <w:r>
+        <w:t>→ Created → Done</w:t>
+      </w:r>
     </w:p>
     <w:p>
       <w:pPr>
@@ -1812,17 +984,8 @@
           <w:b/>
           <w:bCs/>
         </w:rPr>
-        <w:t xml:space="preserve"> </w:t>
-      </w:r>
-      <w:proofErr w:type="spellStart"/>
-      <w:r>
-        <w:rPr>
-          <w:b/>
-          <w:bCs/>
-        </w:rPr>
-        <w:t>Backlog</w:t>
-      </w:r>
-      <w:proofErr w:type="spellEnd"/>
+        <w:t xml:space="preserve"> Backlog</w:t>
+      </w:r>
       <w:r>
         <w:rPr>
           <w:b/>
@@ -1834,39 +997,7 @@
     </w:p>
     <w:p>
       <w:r>
-        <w:t xml:space="preserve">→ </w:t>
-      </w:r>
-      <w:proofErr w:type="spellStart"/>
-      <w:r>
-        <w:t>StateType</w:t>
-      </w:r>
-      <w:proofErr w:type="spellEnd"/>
-      <w:r>
-        <w:t xml:space="preserve"> IN ('</w:t>
-      </w:r>
-      <w:proofErr w:type="spellStart"/>
-      <w:r>
-        <w:t>Backlog</w:t>
-      </w:r>
-      <w:proofErr w:type="spellEnd"/>
-      <w:r>
-        <w:t>', '</w:t>
-      </w:r>
-      <w:proofErr w:type="spellStart"/>
-      <w:r>
-        <w:t>Todo</w:t>
-      </w:r>
-      <w:proofErr w:type="spellEnd"/>
-      <w:r>
-        <w:t xml:space="preserve">', </w:t>
-      </w:r>
-      <w:proofErr w:type="gramStart"/>
-      <w:r>
-        <w:t>etc.</w:t>
-      </w:r>
-      <w:proofErr w:type="gramEnd"/>
-      <w:r>
-        <w:t>)</w:t>
+        <w:t>→ StateType IN ('Backlog', 'Todo', etc.)</w:t>
       </w:r>
     </w:p>
     <w:p>
@@ -1889,51 +1020,13 @@
           <w:b/>
           <w:bCs/>
         </w:rPr>
-        <w:t xml:space="preserve"> </w:t>
-      </w:r>
-      <w:proofErr w:type="spellStart"/>
-      <w:r>
-        <w:rPr>
-          <w:b/>
-          <w:bCs/>
-        </w:rPr>
-        <w:t>Moving</w:t>
-      </w:r>
-      <w:proofErr w:type="spellEnd"/>
-      <w:r>
-        <w:rPr>
-          <w:b/>
-          <w:bCs/>
-        </w:rPr>
-        <w:t xml:space="preserve"> </w:t>
-      </w:r>
-      <w:proofErr w:type="spellStart"/>
-      <w:r>
-        <w:rPr>
-          <w:b/>
-          <w:bCs/>
-        </w:rPr>
-        <w:t>averages</w:t>
-      </w:r>
-      <w:proofErr w:type="spellEnd"/>
-    </w:p>
-    <w:p>
-      <w:r>
-        <w:t xml:space="preserve">→ </w:t>
-      </w:r>
-      <w:proofErr w:type="spellStart"/>
-      <w:r>
-        <w:t>DateKeyCreated</w:t>
-      </w:r>
-      <w:proofErr w:type="spellEnd"/>
-      <w:r>
-        <w:t xml:space="preserve"> / </w:t>
-      </w:r>
-      <w:proofErr w:type="spellStart"/>
-      <w:r>
-        <w:t>DateKeyUpdated</w:t>
-      </w:r>
-      <w:proofErr w:type="spellEnd"/>
+        <w:t xml:space="preserve"> Moving averages</w:t>
+      </w:r>
+    </w:p>
+    <w:p>
+      <w:r>
+        <w:t>→ DateKeyCreated / DateKeyUpdated</w:t>
+      </w:r>
     </w:p>
     <w:p>
       <w:pPr>
@@ -1960,21 +1053,8 @@
     </w:p>
     <w:p>
       <w:r>
-        <w:t xml:space="preserve">→ </w:t>
-      </w:r>
-      <w:proofErr w:type="spellStart"/>
-      <w:r>
-        <w:t>SnapshotTS</w:t>
-      </w:r>
-      <w:proofErr w:type="spellEnd"/>
-      <w:r>
-        <w:t xml:space="preserve"> + </w:t>
-      </w:r>
-      <w:proofErr w:type="spellStart"/>
-      <w:r>
-        <w:t>DimDate</w:t>
-      </w:r>
-      <w:proofErr w:type="spellEnd"/>
+        <w:t>→ SnapshotTS + DimDate</w:t>
+      </w:r>
     </w:p>
     <w:p>
       <w:r>
@@ -1990,17 +1070,8 @@
           <w:b/>
           <w:bCs/>
         </w:rPr>
-        <w:t xml:space="preserve"> </w:t>
-      </w:r>
-      <w:proofErr w:type="spellStart"/>
-      <w:r>
-        <w:rPr>
-          <w:b/>
-          <w:bCs/>
-        </w:rPr>
-        <w:t>Linear</w:t>
-      </w:r>
-      <w:proofErr w:type="spellEnd"/>
+        <w:t xml:space="preserve"> Linear</w:t>
+      </w:r>
       <w:r>
         <w:rPr>
           <w:b/>
@@ -2187,11 +1258,9 @@
             <w:hideMark/>
           </w:tcPr>
           <w:p>
-            <w:proofErr w:type="spellStart"/>
             <w:r>
               <w:t>AssigneeID</w:t>
             </w:r>
-            <w:proofErr w:type="spellEnd"/>
           </w:p>
         </w:tc>
       </w:tr>
@@ -2243,11 +1312,9 @@
             <w:hideMark/>
           </w:tcPr>
           <w:p>
-            <w:proofErr w:type="spellStart"/>
             <w:r>
               <w:t>KPIStatusGroup</w:t>
             </w:r>
-            <w:proofErr w:type="spellEnd"/>
           </w:p>
         </w:tc>
       </w:tr>
@@ -2307,11 +1374,9 @@
             <w:hideMark/>
           </w:tcPr>
           <w:p>
-            <w:proofErr w:type="spellStart"/>
             <w:r>
               <w:t>SnapshotTS</w:t>
             </w:r>
-            <w:proofErr w:type="spellEnd"/>
           </w:p>
         </w:tc>
       </w:tr>
@@ -2363,11 +1428,9 @@
             <w:hideMark/>
           </w:tcPr>
           <w:p>
-            <w:proofErr w:type="spellStart"/>
             <w:r>
               <w:t>DimDate</w:t>
             </w:r>
-            <w:proofErr w:type="spellEnd"/>
           </w:p>
         </w:tc>
       </w:tr>
@@ -2388,31 +1451,13 @@
                 <w:bCs/>
               </w:rPr>
             </w:pPr>
-            <w:proofErr w:type="spellStart"/>
             <w:r>
               <w:rPr>
                 <w:b/>
                 <w:bCs/>
               </w:rPr>
-              <w:t>StateType</w:t>
+              <w:t>StateType + StateName</w:t>
             </w:r>
-            <w:proofErr w:type="spellEnd"/>
-            <w:r>
-              <w:rPr>
-                <w:b/>
-                <w:bCs/>
-              </w:rPr>
-              <w:t xml:space="preserve"> + </w:t>
-            </w:r>
-            <w:proofErr w:type="spellStart"/>
-            <w:r>
-              <w:rPr>
-                <w:b/>
-                <w:bCs/>
-              </w:rPr>
-              <w:t>StateName</w:t>
-            </w:r>
-            <w:proofErr w:type="spellEnd"/>
           </w:p>
         </w:tc>
         <w:tc>
@@ -2460,7 +1505,6 @@
                 <w:bCs/>
               </w:rPr>
             </w:pPr>
-            <w:proofErr w:type="spellStart"/>
             <w:r>
               <w:rPr>
                 <w:b/>
@@ -2468,7 +1512,6 @@
               </w:rPr>
               <w:t>Escalation</w:t>
             </w:r>
-            <w:proofErr w:type="spellEnd"/>
           </w:p>
         </w:tc>
         <w:tc>
@@ -2493,11 +1536,9 @@
             <w:hideMark/>
           </w:tcPr>
           <w:p>
-            <w:proofErr w:type="spellStart"/>
             <w:r>
               <w:t>IsEscalated</w:t>
             </w:r>
-            <w:proofErr w:type="spellEnd"/>
           </w:p>
         </w:tc>
       </w:tr>
@@ -2518,7 +1559,6 @@
                 <w:bCs/>
               </w:rPr>
             </w:pPr>
-            <w:proofErr w:type="spellStart"/>
             <w:r>
               <w:rPr>
                 <w:b/>
@@ -2526,7 +1566,6 @@
               </w:rPr>
               <w:t>Backlog</w:t>
             </w:r>
-            <w:proofErr w:type="spellEnd"/>
             <w:r>
               <w:rPr>
                 <w:b/>
@@ -2559,40 +1598,13 @@
             <w:hideMark/>
           </w:tcPr>
           <w:p>
-            <w:proofErr w:type="spellStart"/>
             <w:r>
-              <w:t>StatusID</w:t>
+              <w:t>StatusID / StateType</w:t>
             </w:r>
-            <w:proofErr w:type="spellEnd"/>
-            <w:r>
-              <w:t xml:space="preserve"> / </w:t>
-            </w:r>
-            <w:proofErr w:type="spellStart"/>
-            <w:r>
-              <w:t>StateType</w:t>
-            </w:r>
-            <w:proofErr w:type="spellEnd"/>
           </w:p>
         </w:tc>
       </w:tr>
     </w:tbl>
-    <w:p>
-      <w:r>
-        <w:rPr>
-          <w:rFonts w:ascii="Segoe UI Emoji" w:hAnsi="Segoe UI Emoji" w:cs="Segoe UI Emoji"/>
-          <w:b/>
-          <w:bCs/>
-        </w:rPr>
-        <w:t>➡️</w:t>
-      </w:r>
-      <w:r>
-        <w:rPr>
-          <w:b/>
-          <w:bCs/>
-        </w:rPr>
-        <w:t xml:space="preserve"> Inget saknas. Modellen är komplett.</w:t>
-      </w:r>
-    </w:p>
     <w:p/>
     <w:sectPr>
       <w:pgSz w:w="11906" w:h="16838"/>

</xml_diff>